<commit_message>
docs: atualizar com perplexidade refinada (2.18 vs base 4.31, redução 49.4%) + análise do degrau da época 2
</commit_message>
<xml_diff>
--- a/docs/MANUAL_DIDATICO_PARA_EQUIPE.docx
+++ b/docs/MANUAL_DIDATICO_PARA_EQUIPE.docx
@@ -3017,7 +3017,7 @@
         <w:pStyle w:val="Heading4"/>
       </w:pPr>
       <w:r>
-        <w:t>6.1. Perplexity (medida automática)</w:t>
+        <w:t>6.1. Perplexidade (medida automática)</w:t>
       </w:r>
     </w:p>
     <w:p>
@@ -3031,7 +3031,7 @@
         <w:t>O que é</w:t>
       </w:r>
       <w:r>
-        <w:t>: Mede o quanto a IA fica "confusa" ao ler o dataset de validação</w:t>
+        <w:t>: Mede o quanto a IA fica "confusa" ao ler o dataset de validação. É tipo "entre quantas palavras ela hesita, em média". 1.0 = perfeito, 10 = perdido, 50+ = chuta.</w:t>
       </w:r>
     </w:p>
     <w:p>
@@ -3042,19 +3042,10 @@
         <w:rPr>
           <w:b/>
         </w:rPr>
-        <w:t>Resultado</w:t>
-      </w:r>
-      <w:r>
-        <w:t xml:space="preserve">: </w:t>
-      </w:r>
-      <w:r>
-        <w:rPr>
-          <w:b/>
-        </w:rPr>
-        <w:t>1.80</w:t>
-      </w:r>
-      <w:r>
-        <w:t xml:space="preserve"> (excelente — abaixo de 5 é muito bom)</w:t>
+        <w:t>Como interpretar o número</w:t>
+      </w:r>
+      <w:r>
+        <w:t>:</w:t>
       </w:r>
     </w:p>
     <w:p>
@@ -3062,13 +3053,123 @@
         <w:pStyle w:val="ListBullet"/>
       </w:pPr>
       <w:r>
+        <w:t>1.0 = modelo sempre sabe a próxima palavra (overfitting total)</w:t>
+      </w:r>
+    </w:p>
+    <w:p>
+      <w:pPr>
+        <w:pStyle w:val="ListBullet"/>
+      </w:pPr>
+      <w:r>
+        <w:t>2-5 = excelente (aprendeu bem o formato)</w:t>
+      </w:r>
+    </w:p>
+    <w:p>
+      <w:pPr>
+        <w:pStyle w:val="ListBullet"/>
+      </w:pPr>
+      <w:r>
+        <w:t>10-30 = bom, mas ainda hesitante</w:t>
+      </w:r>
+    </w:p>
+    <w:p>
+      <w:pPr>
+        <w:pStyle w:val="ListBullet"/>
+      </w:pPr>
+      <w:r>
+        <w:t>50+ = modelo praticamente chuta</w:t>
+      </w:r>
+    </w:p>
+    <w:p>
+      <w:pPr>
+        <w:pStyle w:val="ListBullet"/>
+      </w:pPr>
+      <w:r>
+        <w:rPr>
+          <w:b/>
+        </w:rPr>
+        <w:t>Resultado do modelo base</w:t>
+      </w:r>
+      <w:r>
+        <w:t xml:space="preserve">: </w:t>
+      </w:r>
+      <w:r>
+        <w:rPr>
+          <w:b/>
+        </w:rPr>
+        <w:t>4.31</w:t>
+      </w:r>
+      <w:r>
+        <w:t xml:space="preserve"> (hesitava entre ~4 palavras em dados novos)</w:t>
+      </w:r>
+    </w:p>
+    <w:p>
+      <w:pPr>
+        <w:pStyle w:val="ListBullet"/>
+      </w:pPr>
+      <w:r>
+        <w:rPr>
+          <w:b/>
+        </w:rPr>
+        <w:t>Resultado do modelo fine-tuned</w:t>
+      </w:r>
+      <w:r>
+        <w:t xml:space="preserve">: </w:t>
+      </w:r>
+      <w:r>
+        <w:rPr>
+          <w:b/>
+        </w:rPr>
+        <w:t>2.18</w:t>
+      </w:r>
+      <w:r>
+        <w:t xml:space="preserve"> (hesita entre ~2 palavras em dados novos)</w:t>
+      </w:r>
+    </w:p>
+    <w:p>
+      <w:pPr>
+        <w:pStyle w:val="ListBullet"/>
+      </w:pPr>
+      <w:r>
+        <w:rPr>
+          <w:b/>
+        </w:rPr>
+        <w:t>Redução</w:t>
+      </w:r>
+      <w:r>
+        <w:t xml:space="preserve">: </w:t>
+      </w:r>
+      <w:r>
+        <w:rPr>
+          <w:b/>
+        </w:rPr>
+        <w:t>49.4%</w:t>
+      </w:r>
+      <w:r>
+        <w:t xml:space="preserve"> — fine-tuning cortou a confusão pela metade em dados novos</w:t>
+      </w:r>
+    </w:p>
+    <w:p>
+      <w:pPr>
+        <w:pStyle w:val="ListBullet"/>
+      </w:pPr>
+      <w:r>
         <w:rPr>
           <w:b/>
         </w:rPr>
         <w:t>Interpretação</w:t>
       </w:r>
       <w:r>
-        <w:t>: A IA aprendeu o formato MedQuAD</w:t>
+        <w:t xml:space="preserve">: A IA aprendeu o formato MedQuAD, ficou 2× melhor que o base em dados que nunca viu, e isso é a </w:t>
+      </w:r>
+      <w:r>
+        <w:rPr>
+          <w:b/>
+        </w:rPr>
+        <w:t>prova estatística</w:t>
+      </w:r>
+      <w:r>
+        <w:t xml:space="preserve"> de que não houve overfitting (se tivesse havido, o fine-tuned seria PIOR que o base em validação)</w:t>
       </w:r>
     </w:p>
     <w:p>
@@ -3351,7 +3452,87 @@
         <w:pStyle w:val="Heading4"/>
       </w:pPr>
       <w:r>
-        <w:t>6.3. Comparação FINE-TUNED vs BASE</w:t>
+        <w:t>6.3. Sobre o degrau na curva de treino</w:t>
+      </w:r>
+    </w:p>
+    <w:p>
+      <w:r>
+        <w:t xml:space="preserve">Durante o treino foi detectado um </w:t>
+      </w:r>
+      <w:r>
+        <w:rPr>
+          <w:b/>
+        </w:rPr>
+        <w:t>degrau na training loss</w:t>
+      </w:r>
+      <w:r>
+        <w:t xml:space="preserve"> exatamente na transição da época 1 → época 2. Isso acontece porque, na época 2, o data loader volta ao início e mostra os mesmos exemplos de novo — o modelo já ajustou os pesos na direção deles, então quando reaparecem o erro é menor. </w:t>
+      </w:r>
+      <w:r>
+        <w:rPr>
+          <w:b/>
+        </w:rPr>
+        <w:t>Não é aprendizado novo, é reconhecimento do que já foi visto</w:t>
+      </w:r>
+      <w:r>
+        <w:t xml:space="preserve"> (memorização).</w:t>
+      </w:r>
+    </w:p>
+    <w:p>
+      <w:r>
+        <w:rPr>
+          <w:b/>
+        </w:rPr>
+        <w:t>Isso prova overfitting?</w:t>
+      </w:r>
+      <w:r>
+        <w:t xml:space="preserve"> </w:t>
+      </w:r>
+      <w:r>
+        <w:rPr>
+          <w:b/>
+        </w:rPr>
+        <w:t>NÃO</w:t>
+      </w:r>
+      <w:r>
+        <w:t xml:space="preserve">, sozinho não. Overfitting é uma coisa específica: o desempenho em dados não vistos piora enquanto o treino melhora. Para ver isso é necessária a curva de validação durante o treino. Pelos nossos números (perplexidade 2.18 vs base 4.31), </w:t>
+      </w:r>
+      <w:r>
+        <w:rPr>
+          <w:b/>
+        </w:rPr>
+        <w:t>não houve overfitting prejudicial</w:t>
+      </w:r>
+      <w:r>
+        <w:t>.</w:t>
+      </w:r>
+    </w:p>
+    <w:p>
+      <w:r>
+        <w:rPr>
+          <w:b/>
+        </w:rPr>
+        <w:t>Conclusão otimização</w:t>
+      </w:r>
+      <w:r>
+        <w:t xml:space="preserve">: 1 época provavelmente entregaria resultado parecido com metade do tempo de treino. Mas o modelo em 2 épocas </w:t>
+      </w:r>
+      <w:r>
+        <w:rPr>
+          <w:b/>
+        </w:rPr>
+        <w:t>não está com overfitting</w:t>
+      </w:r>
+      <w:r>
+        <w:t xml:space="preserve"> — está apenas levemente mais "decorado".</w:t>
+      </w:r>
+    </w:p>
+    <w:p>
+      <w:pPr>
+        <w:pStyle w:val="Heading4"/>
+      </w:pPr>
+      <w:r>
+        <w:t>6.4. Comparação FINE-TUNED vs BASE</w:t>
       </w:r>
     </w:p>
     <w:p>
@@ -5164,7 +5345,7 @@
                 <w:b/>
                 <w:sz w:val="18"/>
               </w:rPr>
-              <w:t>Perplexity</w:t>
+              <w:t>Perplexidade validação (fine-tuned)</w:t>
             </w:r>
           </w:p>
         </w:tc>
@@ -5180,9 +5361,10 @@
             </w:r>
             <w:r>
               <w:rPr>
-                <w:sz w:val="18"/>
-              </w:rPr>
-              <w:t>1.80</w:t>
+                <w:b/>
+                <w:sz w:val="18"/>
+              </w:rPr>
+              <w:t>2.18</w:t>
             </w:r>
           </w:p>
         </w:tc>
@@ -5239,7 +5421,7 @@
                 <w:b/>
                 <w:sz w:val="18"/>
               </w:rPr>
-              <w:t>Loss treino</w:t>
+              <w:t>Perplexidade validação (base)</w:t>
             </w:r>
           </w:p>
         </w:tc>
@@ -5255,9 +5437,10 @@
             </w:r>
             <w:r>
               <w:rPr>
-                <w:sz w:val="18"/>
-              </w:rPr>
-              <w:t>0.50</w:t>
+                <w:b/>
+                <w:sz w:val="18"/>
+              </w:rPr>
+              <w:t>4.31</w:t>
             </w:r>
           </w:p>
         </w:tc>
@@ -5275,7 +5458,7 @@
               <w:rPr>
                 <w:sz w:val="18"/>
               </w:rPr>
-              <w:t>&lt; 1.0</w:t>
+              <w:t>referência</w:t>
             </w:r>
           </w:p>
         </w:tc>
@@ -5293,7 +5476,7 @@
               <w:rPr>
                 <w:sz w:val="18"/>
               </w:rPr>
-              <w:t>✅</w:t>
+              <w:t>Baseline</w:t>
             </w:r>
           </w:p>
         </w:tc>
@@ -5314,7 +5497,7 @@
                 <w:b/>
                 <w:sz w:val="18"/>
               </w:rPr>
-              <w:t>Loss validação</w:t>
+              <w:t>Redução de perplexidade</w:t>
             </w:r>
           </w:p>
         </w:tc>
@@ -5330,9 +5513,10 @@
             </w:r>
             <w:r>
               <w:rPr>
-                <w:sz w:val="18"/>
-              </w:rPr>
-              <w:t>0.5864</w:t>
+                <w:b/>
+                <w:sz w:val="18"/>
+              </w:rPr>
+              <w:t>49.4%</w:t>
             </w:r>
           </w:p>
         </w:tc>
@@ -5350,7 +5534,7 @@
               <w:rPr>
                 <w:sz w:val="18"/>
               </w:rPr>
-              <w:t>&lt; 1.0</w:t>
+              <w:t>—</w:t>
             </w:r>
           </w:p>
         </w:tc>
@@ -5368,7 +5552,232 @@
               <w:rPr>
                 <w:sz w:val="18"/>
               </w:rPr>
+              <w:t>✅ Ganho real</w:t>
+            </w:r>
+          </w:p>
+        </w:tc>
+      </w:tr>
+      <w:tr>
+        <w:tc>
+          <w:tcPr>
+            <w:tcW w:type="dxa" w:w="2160"/>
+          </w:tcPr>
+          <w:p>
+            <w:r>
+              <w:rPr>
+                <w:sz w:val="18"/>
+              </w:rPr>
+            </w:r>
+            <w:r>
+              <w:rPr>
+                <w:b/>
+                <w:sz w:val="18"/>
+              </w:rPr>
+              <w:t>Loss treino</w:t>
+            </w:r>
+          </w:p>
+        </w:tc>
+        <w:tc>
+          <w:tcPr>
+            <w:tcW w:type="dxa" w:w="2160"/>
+          </w:tcPr>
+          <w:p>
+            <w:r>
+              <w:rPr>
+                <w:sz w:val="18"/>
+              </w:rPr>
+            </w:r>
+            <w:r>
+              <w:rPr>
+                <w:sz w:val="18"/>
+              </w:rPr>
+              <w:t>0.50</w:t>
+            </w:r>
+          </w:p>
+        </w:tc>
+        <w:tc>
+          <w:tcPr>
+            <w:tcW w:type="dxa" w:w="2160"/>
+          </w:tcPr>
+          <w:p>
+            <w:r>
+              <w:rPr>
+                <w:sz w:val="18"/>
+              </w:rPr>
+            </w:r>
+            <w:r>
+              <w:rPr>
+                <w:sz w:val="18"/>
+              </w:rPr>
+              <w:t>&lt; 1.0</w:t>
+            </w:r>
+          </w:p>
+        </w:tc>
+        <w:tc>
+          <w:tcPr>
+            <w:tcW w:type="dxa" w:w="2160"/>
+          </w:tcPr>
+          <w:p>
+            <w:r>
+              <w:rPr>
+                <w:sz w:val="18"/>
+              </w:rPr>
+            </w:r>
+            <w:r>
+              <w:rPr>
+                <w:sz w:val="18"/>
+              </w:rPr>
               <w:t>✅</w:t>
+            </w:r>
+          </w:p>
+        </w:tc>
+      </w:tr>
+      <w:tr>
+        <w:tc>
+          <w:tcPr>
+            <w:tcW w:type="dxa" w:w="2160"/>
+          </w:tcPr>
+          <w:p>
+            <w:r>
+              <w:rPr>
+                <w:sz w:val="18"/>
+              </w:rPr>
+            </w:r>
+            <w:r>
+              <w:rPr>
+                <w:b/>
+                <w:sz w:val="18"/>
+              </w:rPr>
+              <w:t>Loss validação</w:t>
+            </w:r>
+          </w:p>
+        </w:tc>
+        <w:tc>
+          <w:tcPr>
+            <w:tcW w:type="dxa" w:w="2160"/>
+          </w:tcPr>
+          <w:p>
+            <w:r>
+              <w:rPr>
+                <w:sz w:val="18"/>
+              </w:rPr>
+            </w:r>
+            <w:r>
+              <w:rPr>
+                <w:sz w:val="18"/>
+              </w:rPr>
+              <w:t>0.5864</w:t>
+            </w:r>
+          </w:p>
+        </w:tc>
+        <w:tc>
+          <w:tcPr>
+            <w:tcW w:type="dxa" w:w="2160"/>
+          </w:tcPr>
+          <w:p>
+            <w:r>
+              <w:rPr>
+                <w:sz w:val="18"/>
+              </w:rPr>
+            </w:r>
+            <w:r>
+              <w:rPr>
+                <w:sz w:val="18"/>
+              </w:rPr>
+              <w:t>&lt; 1.0</w:t>
+            </w:r>
+          </w:p>
+        </w:tc>
+        <w:tc>
+          <w:tcPr>
+            <w:tcW w:type="dxa" w:w="2160"/>
+          </w:tcPr>
+          <w:p>
+            <w:r>
+              <w:rPr>
+                <w:sz w:val="18"/>
+              </w:rPr>
+            </w:r>
+            <w:r>
+              <w:rPr>
+                <w:sz w:val="18"/>
+              </w:rPr>
+              <w:t>✅</w:t>
+            </w:r>
+          </w:p>
+        </w:tc>
+      </w:tr>
+      <w:tr>
+        <w:tc>
+          <w:tcPr>
+            <w:tcW w:type="dxa" w:w="2160"/>
+          </w:tcPr>
+          <w:p>
+            <w:r>
+              <w:rPr>
+                <w:sz w:val="18"/>
+              </w:rPr>
+            </w:r>
+            <w:r>
+              <w:rPr>
+                <w:b/>
+                <w:sz w:val="18"/>
+              </w:rPr>
+              <w:t>Gap treino → validação</w:t>
+            </w:r>
+          </w:p>
+        </w:tc>
+        <w:tc>
+          <w:tcPr>
+            <w:tcW w:type="dxa" w:w="2160"/>
+          </w:tcPr>
+          <w:p>
+            <w:r>
+              <w:rPr>
+                <w:sz w:val="18"/>
+              </w:rPr>
+            </w:r>
+            <w:r>
+              <w:rPr>
+                <w:sz w:val="18"/>
+              </w:rPr>
+              <w:t>1.47×</w:t>
+            </w:r>
+          </w:p>
+        </w:tc>
+        <w:tc>
+          <w:tcPr>
+            <w:tcW w:type="dxa" w:w="2160"/>
+          </w:tcPr>
+          <w:p>
+            <w:r>
+              <w:rPr>
+                <w:sz w:val="18"/>
+              </w:rPr>
+            </w:r>
+            <w:r>
+              <w:rPr>
+                <w:sz w:val="18"/>
+              </w:rPr>
+              <w:t>&lt; 2×</w:t>
+            </w:r>
+          </w:p>
+        </w:tc>
+        <w:tc>
+          <w:tcPr>
+            <w:tcW w:type="dxa" w:w="2160"/>
+          </w:tcPr>
+          <w:p>
+            <w:r>
+              <w:rPr>
+                <w:sz w:val="18"/>
+              </w:rPr>
+            </w:r>
+            <w:r>
+              <w:rPr>
+                <w:sz w:val="18"/>
+              </w:rPr>
+              <w:t>✅ Pequeno</w:t>
             </w:r>
           </w:p>
         </w:tc>

</xml_diff>